<commit_message>
Actualizar guias con factor rendimiento
</commit_message>
<xml_diff>
--- a/docs/Guia_casos_uso_usuarios_sistema_anaya.docx
+++ b/docs/Guia_casos_uso_usuarios_sistema_anaya.docx
@@ -1085,7 +1085,7 @@
               <w:pStyle w:val="TableBodyCompact"/>
             </w:pPr>
             <w:r>
-              <w:t>Debe ver pesos, humedad, merma, perfil/tipo y estado.</w:t>
+              <w:t>Debe ver pesos, humedad, factor de rendimiento, clasificacion comercial, perfil/tipo y estado.</w:t>
             </w:r>
           </w:p>
         </w:tc>
@@ -2794,20 +2794,20 @@
               <w:pStyle w:val="TableBodyCompact"/>
             </w:pPr>
             <w:r>
-              <w:t>Registrar humedad y merma por trilla.</w:t>
-            </w:r>
-          </w:p>
-        </w:tc>
-        <w:tc>
-          <w:tcPr>
-            <w:tcW w:type="dxa" w:w="1872"/>
-          </w:tcPr>
-          <w:p>
-            <w:pPr>
-              <w:pStyle w:val="TableBodyCompact"/>
-            </w:pPr>
-            <w:r>
-              <w:t>Los porcentajes quedan visibles en pendientes de laboratorio.</w:t>
+              <w:t>Registrar humedad, factor de rendimiento y clasificacion comercial.</w:t>
+            </w:r>
+          </w:p>
+        </w:tc>
+        <w:tc>
+          <w:tcPr>
+            <w:tcW w:type="dxa" w:w="1872"/>
+          </w:tcPr>
+          <w:p>
+            <w:pPr>
+              <w:pStyle w:val="TableBodyCompact"/>
+            </w:pPr>
+            <w:r>
+              <w:t>Los datos quedan visibles en pendientes de laboratorio.</w:t>
             </w:r>
           </w:p>
         </w:tc>
@@ -2859,7 +2859,7 @@
               <w:pStyle w:val="TableBodyCompact"/>
             </w:pPr>
             <w:r>
-              <w:t>Intentar guardar merma mayor a 100.</w:t>
+              <w:t>Intentar guardar factor de rendimiento negativo.</w:t>
             </w:r>
           </w:p>
         </w:tc>
@@ -3590,7 +3590,7 @@
               <w:pStyle w:val="TableBodyCompact"/>
             </w:pPr>
             <w:r>
-              <w:t>Ver humedad y merma registrada en bodega.</w:t>
+              <w:t>Ver humedad y factor de rendimiento registrado en bodega.</w:t>
             </w:r>
           </w:p>
         </w:tc>

</xml_diff>